<commit_message>
Contestação com reconvenção: ajusta marcadores da lista de despesas
Co-Authored-By: Claude Opus 5.5 <noreply@anthropic.com>
Claude-Session: https://claude.ai/code/session_01PkCgfv992vpnGwFiZN4F49
</commit_message>
<xml_diff>
--- a/0801216-88.2026 - Mariah Ritta/Contestação com reconvenção - Mariah Ritta Borges Miranda.docx
+++ b/0801216-88.2026 - Mariah Ritta/Contestação com reconvenção - Mariah Ritta Borges Miranda.docx
@@ -1525,7 +1525,7 @@
         <w:jc w:val="both"/>
       </w:pPr>
       <w:r>
-        <w:t xml:space="preserve">–.	</w:t>
+        <w:t xml:space="preserve">–	</w:t>
       </w:r>
       <w:r>
         <w:t xml:space="preserve">mensalidade UNINTER: R$ 278,45;</w:t>
@@ -1541,7 +1541,7 @@
         <w:jc w:val="both"/>
       </w:pPr>
       <w:r>
-        <w:t xml:space="preserve">–.	</w:t>
+        <w:t xml:space="preserve">–	</w:t>
       </w:r>
       <w:r>
         <w:t xml:space="preserve">transporte para as atividades presenciais em Teresina: </w:t>
@@ -1568,7 +1568,7 @@
         <w:jc w:val="both"/>
       </w:pPr>
       <w:r>
-        <w:t xml:space="preserve">–.	</w:t>
+        <w:t xml:space="preserve">–	</w:t>
       </w:r>
       <w:r>
         <w:t xml:space="preserve">alimentação: </w:t>
@@ -1595,7 +1595,7 @@
         <w:jc w:val="both"/>
       </w:pPr>
       <w:r>
-        <w:t xml:space="preserve">–.	</w:t>
+        <w:t xml:space="preserve">–	</w:t>
       </w:r>
       <w:r>
         <w:t xml:space="preserve">internet e telefone, indispensáveis ao ensino semipresencial: </w:t>
@@ -1622,7 +1622,7 @@
         <w:jc w:val="both"/>
       </w:pPr>
       <w:r>
-        <w:t xml:space="preserve">–.	</w:t>
+        <w:t xml:space="preserve">–	</w:t>
       </w:r>
       <w:r>
         <w:t xml:space="preserve">material de estudo e equipamentos: </w:t>
@@ -1649,7 +1649,7 @@
         <w:jc w:val="both"/>
       </w:pPr>
       <w:r>
-        <w:t xml:space="preserve">–.	</w:t>
+        <w:t xml:space="preserve">–	</w:t>
       </w:r>
       <w:r>
         <w:t xml:space="preserve">saúde, higiene e vestuário: </w:t>
@@ -1676,7 +1676,7 @@
         <w:jc w:val="both"/>
       </w:pPr>
       <w:r>
-        <w:t xml:space="preserve">–.	</w:t>
+        <w:t xml:space="preserve">–	</w:t>
       </w:r>
       <w:r>
         <w:rPr>

</xml_diff>